<commit_message>
docs: actualizar el numero de pruebas del servicio a 90
</commit_message>
<xml_diff>
--- a/docs/BITACORA_MARTES_2026-09-22.docx
+++ b/docs/BITACORA_MARTES_2026-09-22.docx
@@ -3178,7 +3178,16 @@
           <w:b w:val="0"/>
           <w:sz w:val="22"/>
         </w:rPr>
-        <w:t>no genera ninguna.</w:t>
+        <w:t>no genera ninguna. *(Al cierre de la sesión, con las tres pruebas de trazabilidad del</w:t>
+      </w:r>
+    </w:p>
+    <w:p>
+      <w:r>
+        <w:rPr>
+          <w:b w:val="0"/>
+          <w:sz w:val="22"/>
+        </w:rPr>
+        <w:t>apartado 9, el conjunto queda en 90 casos.)*</w:t>
       </w:r>
     </w:p>
     <w:p>

</xml_diff>

<commit_message>
feat(usuarios): administrar las cuentas desde el servicio (RF-02)
El requisito funcional RF-02 pedia gestionar las cuentas y sus roles y el servicio solo exponia el perfil propio: el panel escribia directamente en la base. Se agregan cuatro operaciones con autorizacion de administrador: listar las cuentas, consultar una, modificar sus datos o su rol o su estado, y eliminar el perfil.

Dos protecciones: no se acepta un rol que el servicio no reconozca, y la administracion no puede quitarse a si misma el rol, desactivar su cuenta ni eliminarla. El perfil propio y la administracion de cuentas usan esquemas de entrada distintos, de modo que el contrato impida la elevacion de privilegios.

Dieciseis pruebas nuevas (106 casos aprobados) y el contrato pasa de 28 a 32 operaciones. Se actualizan la monografia, el entregable, el glosario y la bitacora.
</commit_message>
<xml_diff>
--- a/docs/BITACORA_MARTES_2026-09-22.docx
+++ b/docs/BITACORA_MARTES_2026-09-22.docx
@@ -2340,7 +2340,7 @@
                 <w:b w:val="0"/>
                 <w:sz w:val="20"/>
               </w:rPr>
-              <w:t>Dispositivo simulado, reintento con memoria, consumo de la base (B-3, B-4 y B-5) y trazabilidad de quién registró la lectura (B-2)</w:t>
+              <w:t>Las cinco: dispositivo simulado, reintento con memoria, consumo de la base (B-3, B-4 y B-5), trazabilidad de quién registró la lectura (B-2) y administración de cuentas en el servicio (B-1)</w:t>
             </w:r>
           </w:p>
         </w:tc>
@@ -2354,7 +2354,7 @@
                 <w:b w:val="0"/>
                 <w:sz w:val="20"/>
               </w:rPr>
-              <w:t>B-1 (operaciones de administración de usuarios en el servicio)</w:t>
+              <w:t>—</w:t>
             </w:r>
           </w:p>
         </w:tc>
@@ -3820,7 +3820,7 @@
                 <w:b w:val="0"/>
                 <w:sz w:val="20"/>
               </w:rPr>
-              <w:t>Los tres pasan a tener métrica verificable: cero credenciales en el repositorio y su historial, 100 % de respuestas 401 y 403 donde corresponde, cinco colecciones cerradas al cliente anónimo, 28 operaciones en el contrato y 100 % de lecturas con origen, autor y marca de tiempo</w:t>
+              <w:t>Los tres pasan a tener métrica verificable: cero credenciales en el repositorio y su historial, 100 % de respuestas 401 y 403 donde corresponde, cinco colecciones cerradas al cliente anónimo, 32 operaciones en el contrato y 100 % de lecturas con origen, autor y marca de tiempo</w:t>
             </w:r>
           </w:p>
         </w:tc>
@@ -4073,7 +4073,368 @@
         <w:pStyle w:val="Heading1"/>
       </w:pPr>
       <w:r>
-        <w:t>10. Próximos pasos</w:t>
+        <w:t>10. Las cuentas se administran desde el servicio (B-1)</w:t>
+      </w:r>
+    </w:p>
+    <w:p>
+      <w:r>
+        <w:rPr>
+          <w:b w:val="0"/>
+          <w:sz w:val="22"/>
+        </w:rPr>
+        <w:t>El requisito funcional RF-02 pedía gestionar las cuentas y sus roles, y el servicio</w:t>
+      </w:r>
+    </w:p>
+    <w:p>
+      <w:r>
+        <w:rPr>
+          <w:b w:val="0"/>
+          <w:sz w:val="22"/>
+        </w:rPr>
+        <w:t>solo exponía el perfil propio: el panel de usuarios escribía **directamente en la base</w:t>
+      </w:r>
+    </w:p>
+    <w:p>
+      <w:r>
+        <w:rPr>
+          <w:b w:val="0"/>
+          <w:sz w:val="22"/>
+        </w:rPr>
+        <w:t>de datos**. Se agregaron cuatro operaciones, todas con autorización de administrador:</w:t>
+      </w:r>
+    </w:p>
+    <w:tbl>
+      <w:tblPr>
+        <w:tblStyle w:val="TableGrid"/>
+        <w:tblW w:type="auto" w:w="0"/>
+        <w:jc w:val="center"/>
+        <w:tblLook w:firstColumn="1" w:firstRow="1" w:lastColumn="0" w:lastRow="0" w:noHBand="0" w:noVBand="1" w:val="04A0"/>
+      </w:tblPr>
+      <w:tblGrid>
+        <w:gridCol w:w="4320"/>
+        <w:gridCol w:w="4320"/>
+      </w:tblGrid>
+      <w:tr>
+        <w:tc>
+          <w:tcPr>
+            <w:tcW w:type="dxa" w:w="4320"/>
+          </w:tcPr>
+          <w:p>
+            <w:r>
+              <w:rPr>
+                <w:b/>
+                <w:sz w:val="20"/>
+              </w:rPr>
+              <w:t>Operación</w:t>
+            </w:r>
+          </w:p>
+        </w:tc>
+        <w:tc>
+          <w:tcPr>
+            <w:tcW w:type="dxa" w:w="4320"/>
+          </w:tcPr>
+          <w:p>
+            <w:r>
+              <w:rPr>
+                <w:b/>
+                <w:sz w:val="20"/>
+              </w:rPr>
+              <w:t>Para qué</w:t>
+            </w:r>
+          </w:p>
+        </w:tc>
+      </w:tr>
+      <w:tr>
+        <w:tc>
+          <w:tcPr>
+            <w:tcW w:type="dxa" w:w="4320"/>
+          </w:tcPr>
+          <w:p>
+            <w:r>
+              <w:rPr>
+                <w:b w:val="0"/>
+                <w:sz w:val="20"/>
+              </w:rPr>
+              <w:t>GET /api/v1/usuarios</w:t>
+            </w:r>
+          </w:p>
+        </w:tc>
+        <w:tc>
+          <w:tcPr>
+            <w:tcW w:type="dxa" w:w="4320"/>
+          </w:tcPr>
+          <w:p>
+            <w:r>
+              <w:rPr>
+                <w:b w:val="0"/>
+                <w:sz w:val="20"/>
+              </w:rPr>
+              <w:t>Lista las cuentas con su rol y su estado</w:t>
+            </w:r>
+          </w:p>
+        </w:tc>
+      </w:tr>
+      <w:tr>
+        <w:tc>
+          <w:tcPr>
+            <w:tcW w:type="dxa" w:w="4320"/>
+          </w:tcPr>
+          <w:p>
+            <w:r>
+              <w:rPr>
+                <w:b w:val="0"/>
+                <w:sz w:val="20"/>
+              </w:rPr>
+              <w:t>GET /api/v1/usuarios/{uid}</w:t>
+            </w:r>
+          </w:p>
+        </w:tc>
+        <w:tc>
+          <w:tcPr>
+            <w:tcW w:type="dxa" w:w="4320"/>
+          </w:tcPr>
+          <w:p>
+            <w:r>
+              <w:rPr>
+                <w:b w:val="0"/>
+                <w:sz w:val="20"/>
+              </w:rPr>
+              <w:t>Consulta una cuenta</w:t>
+            </w:r>
+          </w:p>
+        </w:tc>
+      </w:tr>
+      <w:tr>
+        <w:tc>
+          <w:tcPr>
+            <w:tcW w:type="dxa" w:w="4320"/>
+          </w:tcPr>
+          <w:p>
+            <w:r>
+              <w:rPr>
+                <w:b w:val="0"/>
+                <w:sz w:val="20"/>
+              </w:rPr>
+              <w:t>PATCH /api/v1/usuarios/{uid}</w:t>
+            </w:r>
+          </w:p>
+        </w:tc>
+        <w:tc>
+          <w:tcPr>
+            <w:tcW w:type="dxa" w:w="4320"/>
+          </w:tcPr>
+          <w:p>
+            <w:r>
+              <w:rPr>
+                <w:b w:val="0"/>
+                <w:sz w:val="20"/>
+              </w:rPr>
+              <w:t>Modifica sus datos, cambia su rol, la activa o la desactiva</w:t>
+            </w:r>
+          </w:p>
+        </w:tc>
+      </w:tr>
+      <w:tr>
+        <w:tc>
+          <w:tcPr>
+            <w:tcW w:type="dxa" w:w="4320"/>
+          </w:tcPr>
+          <w:p>
+            <w:r>
+              <w:rPr>
+                <w:b w:val="0"/>
+                <w:sz w:val="20"/>
+              </w:rPr>
+              <w:t>DELETE /api/v1/usuarios/{uid}</w:t>
+            </w:r>
+          </w:p>
+        </w:tc>
+        <w:tc>
+          <w:tcPr>
+            <w:tcW w:type="dxa" w:w="4320"/>
+          </w:tcPr>
+          <w:p>
+            <w:r>
+              <w:rPr>
+                <w:b w:val="0"/>
+                <w:sz w:val="20"/>
+              </w:rPr>
+              <w:t>Elimina el perfil de la cuenta</w:t>
+            </w:r>
+          </w:p>
+        </w:tc>
+      </w:tr>
+    </w:tbl>
+    <w:p/>
+    <w:p>
+      <w:r>
+        <w:rPr>
+          <w:b w:val="0"/>
+          <w:sz w:val="22"/>
+        </w:rPr>
+        <w:t>Dos protecciones deliberadas. No se acepta un rol que el servicio no reconozca</w:t>
+      </w:r>
+    </w:p>
+    <w:p>
+      <w:r>
+        <w:rPr>
+          <w:b w:val="0"/>
+          <w:sz w:val="22"/>
+        </w:rPr>
+        <w:t>—dejaría una cuenta con un rol que no resuelve ninguna atribución— y la administración</w:t>
+      </w:r>
+    </w:p>
+    <w:p>
+      <w:r>
+        <w:rPr>
+          <w:b w:val="0"/>
+          <w:sz w:val="22"/>
+        </w:rPr>
+        <w:t>no puede quitarse a sí misma el rol, desactivar su cuenta ni eliminarla: sin esa</w:t>
+      </w:r>
+    </w:p>
+    <w:p>
+      <w:r>
+        <w:rPr>
+          <w:b w:val="0"/>
+          <w:sz w:val="22"/>
+        </w:rPr>
+        <w:t>comprobación, un descuido dejaría el sistema sin nadie que pueda administrarlo. La</w:t>
+      </w:r>
+    </w:p>
+    <w:p>
+      <w:r>
+        <w:rPr>
+          <w:b w:val="0"/>
+          <w:sz w:val="22"/>
+        </w:rPr>
+        <w:t>separación entre el perfil propio y la administración de las cuentas se resolvió con</w:t>
+      </w:r>
+    </w:p>
+    <w:p>
+      <w:r>
+        <w:rPr>
+          <w:b w:val="0"/>
+          <w:sz w:val="22"/>
+        </w:rPr>
+        <w:t>dos esquemas de entrada distintos, de modo que sea el contrato —y no solo la</w:t>
+      </w:r>
+    </w:p>
+    <w:p>
+      <w:r>
+        <w:rPr>
+          <w:b w:val="0"/>
+          <w:sz w:val="22"/>
+        </w:rPr>
+        <w:t>interfaz— el que impida la elevación de privilegios.</w:t>
+      </w:r>
+    </w:p>
+    <w:p>
+      <w:r>
+        <w:rPr>
+          <w:b w:val="0"/>
+          <w:sz w:val="22"/>
+        </w:rPr>
+        <w:t>Verificación. Dieciséis pruebas nuevas cubren el listado, la consulta, el cambio de</w:t>
+      </w:r>
+    </w:p>
+    <w:p>
+      <w:r>
+        <w:rPr>
+          <w:b w:val="0"/>
+          <w:sz w:val="22"/>
+        </w:rPr>
+        <w:t>rol, la desactivación —incluida su consecuencia: la cuenta desactivada deja de operar,</w:t>
+      </w:r>
+    </w:p>
+    <w:p>
+      <w:r>
+        <w:rPr>
+          <w:b w:val="0"/>
+          <w:sz w:val="22"/>
+        </w:rPr>
+        <w:t>porque la autorización se resuelve contra el perfil almacenado en cada petición—, el</w:t>
+      </w:r>
+    </w:p>
+    <w:p>
+      <w:r>
+        <w:rPr>
+          <w:b w:val="0"/>
+          <w:sz w:val="22"/>
+        </w:rPr>
+        <w:t>rechazo del rol inexistente y las tres protecciones. El contrato pasa de **28 a 32</w:t>
+      </w:r>
+    </w:p>
+    <w:p>
+      <w:r>
+        <w:rPr>
+          <w:b w:val="0"/>
+          <w:sz w:val="22"/>
+        </w:rPr>
+        <w:t>operaciones y el conjunto del servicio queda en 106 casos aprobados**.</w:t>
+      </w:r>
+    </w:p>
+    <w:p>
+      <w:r>
+        <w:rPr>
+          <w:b w:val="0"/>
+          <w:sz w:val="22"/>
+        </w:rPr>
+        <w:t>Lo que queda de este punto. El panel de usuarios puede migrar a estas operaciones</w:t>
+      </w:r>
+    </w:p>
+    <w:p>
+      <w:r>
+        <w:rPr>
+          <w:b w:val="0"/>
+          <w:sz w:val="22"/>
+        </w:rPr>
+        <w:t>—hoy sigue escribiendo en la base, que las reglas de seguridad permiten solo para la</w:t>
+      </w:r>
+    </w:p>
+    <w:p>
+      <w:r>
+        <w:rPr>
+          <w:b w:val="0"/>
+          <w:sz w:val="22"/>
+        </w:rPr>
+        <w:t>colección usuarios—; esa migración se deja para después del E2, cuando la migración</w:t>
+      </w:r>
+    </w:p>
+    <w:p>
+      <w:r>
+        <w:rPr>
+          <w:b w:val="0"/>
+          <w:sz w:val="22"/>
+        </w:rPr>
+        <w:t>no compita con la demostración del sábado. Hecha la migración, las reglas podrían</w:t>
+      </w:r>
+    </w:p>
+    <w:p>
+      <w:r>
+        <w:rPr>
+          <w:b w:val="0"/>
+          <w:sz w:val="22"/>
+        </w:rPr>
+        <w:t>cerrar también esa colección al cliente.</w:t>
+      </w:r>
+    </w:p>
+    <w:p>
+      <w:r>
+        <w:rPr>
+          <w:b w:val="0"/>
+          <w:color w:val="555555"/>
+          <w:sz w:val="18"/>
+        </w:rPr>
+        <w:t>____________________________________________________________</w:t>
+      </w:r>
+    </w:p>
+    <w:p>
+      <w:pPr>
+        <w:pStyle w:val="Heading1"/>
+      </w:pPr>
+      <w:r>
+        <w:t>11. Próximos pasos</w:t>
       </w:r>
     </w:p>
     <w:tbl>
@@ -4201,7 +4562,7 @@
                 <w:b w:val="0"/>
                 <w:sz w:val="20"/>
               </w:rPr>
-              <w:t>Implementar en el servicio las operaciones de administración de usuarios (RF-02 y B-1)</w:t>
+              <w:t>Cerrar A-4 (ámbito del módulo piloto), A-11 y A-12 con el tutor</w:t>
             </w:r>
           </w:p>
         </w:tc>
@@ -4215,7 +4576,7 @@
                 <w:b w:val="0"/>
                 <w:sz w:val="20"/>
               </w:rPr>
-              <w:t>Antes del sábado 26</w:t>
+              <w:t>Durante la semana</w:t>
             </w:r>
           </w:p>
         </w:tc>
@@ -4245,7 +4606,7 @@
                 <w:b w:val="0"/>
                 <w:sz w:val="20"/>
               </w:rPr>
-              <w:t>Cerrar A-4 (ámbito del módulo piloto), A-11 y A-12 con el tutor</w:t>
+              <w:t>Migrar el panel de usuarios a las operaciones del servicio y cerrar la colección en las reglas</w:t>
             </w:r>
           </w:p>
         </w:tc>
@@ -4259,7 +4620,7 @@
                 <w:b w:val="0"/>
                 <w:sz w:val="20"/>
               </w:rPr>
-              <w:t>Durante la semana</w:t>
+              <w:t>Después del E2</w:t>
             </w:r>
           </w:p>
         </w:tc>

</xml_diff>